<commit_message>
Fase 4 dokument opdateer
</commit_message>
<xml_diff>
--- a/Fases_Dokumentasie/Fase4_JS+Multimedia.docx
+++ b/Fases_Dokumentasie/Fase4_JS+Multimedia.docx
@@ -1615,50 +1615,6 @@
     </w:p>
     <w:p>
       <w:pPr>
-        <w:pStyle w:val="Heading3"/>
-        <w:spacing w:after="240"/>
-      </w:pPr>
-      <w:bookmarkStart w:id="11" w:name="_Toc226443021"/>
-      <w:bookmarkStart w:id="12" w:name="_Toc226457388"/>
-      <w:r>
-        <w:t>Voorwaardes (if en if else)</w:t>
-      </w:r>
-      <w:bookmarkEnd w:id="11"/>
-      <w:bookmarkEnd w:id="12"/>
-    </w:p>
-    <w:p>
-      <w:pPr>
-        <w:spacing w:after="0"/>
-      </w:pPr>
-      <w:r>
-        <w:t>Ek gebruik dit vir vorm validasie , wysiging en versteek van elemene , waarskuwings , galerye , voorraadbestuur en video interaksie</w:t>
-      </w:r>
-      <w:r>
-        <w:t xml:space="preserve">, </w:t>
-      </w:r>
-      <w:r>
-        <w:t xml:space="preserve">dit wil se ek gebruik dit om </w:t>
-      </w:r>
-      <w:r>
-        <w:t>realistiese besigheidslogika toe te pas</w:t>
-      </w:r>
-      <w:r>
-        <w:t>.</w:t>
-      </w:r>
-    </w:p>
-    <w:p>
-      <w:pPr>
-        <w:spacing w:after="0"/>
-      </w:pPr>
-      <w:r>
-        <w:t>Waar ek voorwaardes gebruik en hoekom</w:t>
-      </w:r>
-      <w:r>
-        <w:t>:</w:t>
-      </w:r>
-    </w:p>
-    <w:p>
-      <w:pPr>
         <w:pStyle w:val="ListParagraph"/>
         <w:numPr>
           <w:ilvl w:val="0"/>
@@ -1667,61 +1623,45 @@
         <w:ind w:left="567" w:hanging="283"/>
       </w:pPr>
       <w:r>
-        <w:t xml:space="preserve">Ek gebruik dit </w:t>
-      </w:r>
-      <w:r>
-        <w:t>in</w:t>
-      </w:r>
-      <w:r>
-        <w:t xml:space="preserve"> my </w:t>
-      </w:r>
-      <w:r>
-        <w:t>voorraadbestuur blad om die status te toets.</w:t>
-      </w:r>
-    </w:p>
-    <w:p>
-      <w:pPr>
-        <w:pStyle w:val="ListParagraph"/>
-        <w:numPr>
-          <w:ilvl w:val="1"/>
-          <w:numId w:val="48"/>
-        </w:numPr>
-      </w:pPr>
-      <w:r>
-        <w:t>Toets of die hoeveelheid ‘n getal is, herbestel by ‘n getal is en of hoeveelheid kleiner as herbestel by se waarde is.</w:t>
-      </w:r>
-    </w:p>
-    <w:p>
-      <w:pPr>
-        <w:pStyle w:val="ListParagraph"/>
-        <w:numPr>
-          <w:ilvl w:val="1"/>
-          <w:numId w:val="48"/>
-        </w:numPr>
-      </w:pPr>
-      <w:r>
-        <w:t>As dit die geval is is die status laag.</w:t>
-      </w:r>
-    </w:p>
-    <w:p>
-      <w:pPr>
-        <w:pStyle w:val="ListParagraph"/>
-        <w:numPr>
-          <w:ilvl w:val="1"/>
-          <w:numId w:val="48"/>
-        </w:numPr>
-      </w:pPr>
-      <w:r>
-        <w:t xml:space="preserve">Dit is in die funksie </w:t>
-      </w:r>
-      <w:r>
-        <w:rPr>
-          <w:rStyle w:val="CSSKlasreelsChar"/>
-        </w:rPr>
-        <w:t>toggleAddressField()</w:t>
-      </w:r>
-      <w:r>
-        <w:t>.</w:t>
+        <w:t>Ek gebruik ook map om my mandjie opsomming te bou.</w:t>
+      </w:r>
+    </w:p>
+    <w:p>
+      <w:pPr>
+        <w:pStyle w:val="Heading3"/>
+        <w:spacing w:after="240"/>
+      </w:pPr>
+      <w:bookmarkStart w:id="11" w:name="_Toc226443021"/>
+      <w:bookmarkStart w:id="12" w:name="_Toc226457388"/>
+      <w:r>
+        <w:t>Voorwaardes (if en if else)</w:t>
+      </w:r>
+      <w:bookmarkEnd w:id="11"/>
+      <w:bookmarkEnd w:id="12"/>
+    </w:p>
+    <w:p>
+      <w:pPr>
+        <w:spacing w:after="0"/>
+      </w:pPr>
+      <w:r>
+        <w:t>Ek gebruik dit vir vorm validasie , wysiging en versteek van elemene , waarskuwings , galerye , voorraadbestuur en video interaksie</w:t>
+      </w:r>
+      <w:r>
+        <w:t xml:space="preserve">, </w:t>
+      </w:r>
+      <w:r>
+        <w:t>dit wil se ek gebruik dit om realistiese besigheidslogika toe te pas.</w:t>
+      </w:r>
+    </w:p>
+    <w:p>
+      <w:pPr>
+        <w:spacing w:after="0"/>
+      </w:pPr>
+      <w:r>
+        <w:t>Waar ek voorwaardes gebruik en hoekom</w:t>
+      </w:r>
+      <w:r>
+        <w:t>:</w:t>
       </w:r>
     </w:p>
     <w:p>
@@ -1734,7 +1674,16 @@
         <w:ind w:left="567" w:hanging="283"/>
       </w:pPr>
       <w:r>
-        <w:t>Ek gebruik dit in my bestelvorm vir die afhaal en of aflewering opsies.</w:t>
+        <w:t xml:space="preserve">Ek gebruik dit </w:t>
+      </w:r>
+      <w:r>
+        <w:t>in</w:t>
+      </w:r>
+      <w:r>
+        <w:t xml:space="preserve"> my </w:t>
+      </w:r>
+      <w:r>
+        <w:t>voorraadbestuur blad om die status te toets.</w:t>
       </w:r>
     </w:p>
     <w:p>
@@ -1746,10 +1695,7 @@
         </w:numPr>
       </w:pPr>
       <w:r>
-        <w:t xml:space="preserve">As die gebruiker self afhaal kies verskyn die </w:t>
-      </w:r>
-      <w:r>
-        <w:t>datum en tyd velde</w:t>
+        <w:t>Toets of die hoeveelheid ‘n getal is, herbestel by ‘n getal is en of hoeveelheid kleiner as herbestel by se waarde is.</w:t>
       </w:r>
     </w:p>
     <w:p>
@@ -1761,7 +1707,7 @@
         </w:numPr>
       </w:pPr>
       <w:r>
-        <w:t>Anders verskyn die adres veld blok.</w:t>
+        <w:t>As dit die geval is is die status laag.</w:t>
       </w:r>
     </w:p>
     <w:p>
@@ -1773,49 +1719,16 @@
         </w:numPr>
       </w:pPr>
       <w:r>
-        <w:t xml:space="preserve">Dit is in die funksies </w:t>
+        <w:t xml:space="preserve">Dit is in die funksie </w:t>
       </w:r>
       <w:r>
         <w:rPr>
           <w:rStyle w:val="CSSKlasreelsChar"/>
         </w:rPr>
-        <w:t>calculateTotal()</w:t>
-      </w:r>
-      <w:r>
-        <w:t xml:space="preserve"> en </w:t>
-      </w:r>
-      <w:r>
-        <w:rPr>
-          <w:rStyle w:val="CSSKlasreelsChar"/>
-        </w:rPr>
-        <w:t>updatePaymentVisibility()</w:t>
+        <w:t>toggleAddressField()</w:t>
       </w:r>
       <w:r>
         <w:t>.</w:t>
-      </w:r>
-    </w:p>
-    <w:p>
-      <w:pPr>
-        <w:pStyle w:val="ListParagraph"/>
-        <w:numPr>
-          <w:ilvl w:val="1"/>
-          <w:numId w:val="48"/>
-        </w:numPr>
-      </w:pPr>
-      <w:r>
-        <w:t>Veiligheidskontrole vir die kaartbesonderhede wat toets of die elemente bestaan, voorkom javascriptfoute as die element nie bestaan nie en verander die sigbaarheid van die veld.</w:t>
-      </w:r>
-    </w:p>
-    <w:p>
-      <w:pPr>
-        <w:pStyle w:val="ListParagraph"/>
-        <w:numPr>
-          <w:ilvl w:val="1"/>
-          <w:numId w:val="48"/>
-        </w:numPr>
-      </w:pPr>
-      <w:r>
-        <w:t>Ek gebruik dit ook vir validasie op alle velde</w:t>
       </w:r>
     </w:p>
     <w:p>
@@ -1828,13 +1741,88 @@
         <w:ind w:left="567" w:hanging="283"/>
       </w:pPr>
       <w:r>
-        <w:t xml:space="preserve">Ek gebruik dit in my kontakvorm vir validasie en om die boodskapveld verpligtend te maak as </w:t>
-      </w:r>
-      <w:r>
-        <w:t>navrae</w:t>
-      </w:r>
-      <w:r>
-        <w:t xml:space="preserve"> gekies is.</w:t>
+        <w:t>Ek gebruik dit in my bestelvorm vir die afhaal en of aflewering opsies.</w:t>
+      </w:r>
+    </w:p>
+    <w:p>
+      <w:pPr>
+        <w:pStyle w:val="ListParagraph"/>
+        <w:numPr>
+          <w:ilvl w:val="1"/>
+          <w:numId w:val="48"/>
+        </w:numPr>
+      </w:pPr>
+      <w:r>
+        <w:t xml:space="preserve">As die gebruiker self afhaal kies verskyn die </w:t>
+      </w:r>
+      <w:r>
+        <w:t>datum en tyd velde</w:t>
+      </w:r>
+    </w:p>
+    <w:p>
+      <w:pPr>
+        <w:pStyle w:val="ListParagraph"/>
+        <w:numPr>
+          <w:ilvl w:val="1"/>
+          <w:numId w:val="48"/>
+        </w:numPr>
+      </w:pPr>
+      <w:r>
+        <w:t>Anders verskyn die adres veld blok.</w:t>
+      </w:r>
+    </w:p>
+    <w:p>
+      <w:pPr>
+        <w:pStyle w:val="ListParagraph"/>
+        <w:numPr>
+          <w:ilvl w:val="1"/>
+          <w:numId w:val="48"/>
+        </w:numPr>
+      </w:pPr>
+      <w:r>
+        <w:t xml:space="preserve">Dit is in die funksies </w:t>
+      </w:r>
+      <w:r>
+        <w:rPr>
+          <w:rStyle w:val="CSSKlasreelsChar"/>
+        </w:rPr>
+        <w:t>calculateTotal()</w:t>
+      </w:r>
+      <w:r>
+        <w:t xml:space="preserve"> en </w:t>
+      </w:r>
+      <w:r>
+        <w:rPr>
+          <w:rStyle w:val="CSSKlasreelsChar"/>
+        </w:rPr>
+        <w:t>updatePaymentVisibility()</w:t>
+      </w:r>
+      <w:r>
+        <w:t>.</w:t>
+      </w:r>
+    </w:p>
+    <w:p>
+      <w:pPr>
+        <w:pStyle w:val="ListParagraph"/>
+        <w:numPr>
+          <w:ilvl w:val="1"/>
+          <w:numId w:val="48"/>
+        </w:numPr>
+      </w:pPr>
+      <w:r>
+        <w:t>Veiligheidskontrole vir die kaartbesonderhede wat toets of die elemente bestaan, voorkom javascriptfoute as die element nie bestaan nie en verander die sigbaarheid van die veld.</w:t>
+      </w:r>
+    </w:p>
+    <w:p>
+      <w:pPr>
+        <w:pStyle w:val="ListParagraph"/>
+        <w:numPr>
+          <w:ilvl w:val="1"/>
+          <w:numId w:val="48"/>
+        </w:numPr>
+      </w:pPr>
+      <w:r>
+        <w:t>Ek gebruik dit ook vir validasie op alle velde</w:t>
       </w:r>
     </w:p>
     <w:p>
@@ -1847,10 +1835,13 @@
         <w:ind w:left="567" w:hanging="283"/>
       </w:pPr>
       <w:r>
-        <w:t xml:space="preserve">Ek gebruik dit in my </w:t>
-      </w:r>
-      <w:r>
-        <w:t>galerye om deur die skyfies te beweeg.</w:t>
+        <w:t xml:space="preserve">Ek gebruik dit in my kontakvorm vir validasie en om die boodskapveld verpligtend te maak as </w:t>
+      </w:r>
+      <w:r>
+        <w:t>navrae</w:t>
+      </w:r>
+      <w:r>
+        <w:t xml:space="preserve"> gekies is.</w:t>
       </w:r>
     </w:p>
     <w:p>
@@ -1863,7 +1854,10 @@
         <w:ind w:left="567" w:hanging="283"/>
       </w:pPr>
       <w:r>
-        <w:t>Ek gebruik dit ook om ‘n boodskap te vertoon eerder as ‘n lee lys as daar geen verkope is.</w:t>
+        <w:t xml:space="preserve">Ek gebruik dit in my </w:t>
+      </w:r>
+      <w:r>
+        <w:t>galerye om deur die skyfies te beweeg.</w:t>
       </w:r>
     </w:p>
     <w:p>
@@ -1876,7 +1870,7 @@
         <w:ind w:left="567" w:hanging="283"/>
       </w:pPr>
       <w:r>
-        <w:t>Ek gebruik dit sodat die skakel knoppie outomaties aan die einde van die video verskyn.</w:t>
+        <w:t>Ek gebruik dit ook om ‘n boodskap te vertoon eerder as ‘n lee lys as daar geen verkope is.</w:t>
       </w:r>
     </w:p>
     <w:p>
@@ -1889,7 +1883,7 @@
         <w:ind w:left="567" w:hanging="283"/>
       </w:pPr>
       <w:r>
-        <w:t>Ek gebruik dit om my datum te beperk sodat dit net van more af gekies kan word.</w:t>
+        <w:t>Ek gebruik dit sodat die skakel knoppie outomaties aan die einde van die video verskyn.</w:t>
       </w:r>
     </w:p>
     <w:p>
@@ -1902,7 +1896,33 @@
         <w:ind w:left="567" w:hanging="283"/>
       </w:pPr>
       <w:r>
+        <w:t>Ek gebruik dit om my datum te beperk sodat dit net van more af gekies kan word.</w:t>
+      </w:r>
+    </w:p>
+    <w:p>
+      <w:pPr>
+        <w:pStyle w:val="ListParagraph"/>
+        <w:numPr>
+          <w:ilvl w:val="0"/>
+          <w:numId w:val="48"/>
+        </w:numPr>
+        <w:ind w:left="567" w:hanging="283"/>
+      </w:pPr>
+      <w:r>
         <w:t>Ek gebruik dit ook om velde in my voorraadtabel by te voeg , te verwyder en te filter</w:t>
+      </w:r>
+    </w:p>
+    <w:p>
+      <w:pPr>
+        <w:pStyle w:val="ListParagraph"/>
+        <w:numPr>
+          <w:ilvl w:val="0"/>
+          <w:numId w:val="48"/>
+        </w:numPr>
+        <w:ind w:left="567" w:hanging="283"/>
+      </w:pPr>
+      <w:r>
+        <w:t>Ek gebruik voorwaardes by my intekenopsie en inkopie mandjie om te toets of daar reeds items in die mandjie is en om die gebruiker reeds ingeteken is.</w:t>
       </w:r>
     </w:p>
     <w:p>
@@ -1932,10 +1952,7 @@
         <w:t xml:space="preserve">Ek gebruik </w:t>
       </w:r>
       <w:r>
-        <w:t xml:space="preserve">DOM - </w:t>
-      </w:r>
-      <w:r>
-        <w:t xml:space="preserve">manipulasie </w:t>
+        <w:t xml:space="preserve">DOM - manipulasie </w:t>
       </w:r>
       <w:r>
         <w:t>om sekere aspekte op die webblad</w:t>
@@ -2021,55 +2038,82 @@
         <w:ind w:left="567" w:hanging="283"/>
       </w:pPr>
       <w:r>
-        <w:t>Dit bou ook elke keer die 3 prente in my produkte galery as jy beweeg.</w:t>
-      </w:r>
-    </w:p>
-    <w:p>
-      <w:pPr>
-        <w:pStyle w:val="ListParagraph"/>
-        <w:numPr>
-          <w:ilvl w:val="1"/>
-          <w:numId w:val="48"/>
-        </w:numPr>
-      </w:pPr>
-      <w:r>
-        <w:t xml:space="preserve">Dit is in die funksies: </w:t>
+        <w:t xml:space="preserve">Ek gebruik dit in my inkopie mandjie om die telling </w:t>
       </w:r>
       <w:r>
         <w:rPr>
           <w:rStyle w:val="CSSKlasreelsChar"/>
         </w:rPr>
-        <w:t>showSlide(i)</w:t>
-      </w:r>
-      <w:r>
-        <w:t xml:space="preserve"> , </w:t>
+        <w:t>(</w:t>
       </w:r>
       <w:r>
         <w:rPr>
           <w:rStyle w:val="CSSKlasreelsChar"/>
         </w:rPr>
-        <w:t>initMiniGalleries()</w:t>
-      </w:r>
-      <w:r>
-        <w:t xml:space="preserve"> , </w:t>
+        <w:t>updateCartCount()</w:t>
       </w:r>
       <w:r>
         <w:rPr>
           <w:rStyle w:val="CSSKlasreelsChar"/>
         </w:rPr>
-        <w:t>showMiniSlide(index)</w:t>
-      </w:r>
-      <w:r>
-        <w:t xml:space="preserve"> en </w:t>
+        <w:t>)</w:t>
+      </w:r>
+      <w:r>
+        <w:t xml:space="preserve"> op te</w:t>
+      </w:r>
+      <w:r>
+        <w:t xml:space="preserve"> </w:t>
+      </w:r>
+      <w:r>
+        <w:t>dateer</w:t>
+      </w:r>
+      <w:r>
+        <w:t xml:space="preserve">, om die mandjie te skep en vertoon </w:t>
       </w:r>
       <w:r>
         <w:rPr>
           <w:rStyle w:val="CSSKlasreelsChar"/>
         </w:rPr>
-        <w:t>renderCarousel()</w:t>
-      </w:r>
-      <w:r>
-        <w:t>.</w:t>
+        <w:t>(</w:t>
+      </w:r>
+      <w:r>
+        <w:rPr>
+          <w:rStyle w:val="CSSKlasreelsChar"/>
+        </w:rPr>
+        <w:t>showCart()</w:t>
+      </w:r>
+      <w:r>
+        <w:rPr>
+          <w:rStyle w:val="CSSKlasreelsChar"/>
+        </w:rPr>
+        <w:t>)</w:t>
+      </w:r>
+      <w:r>
+        <w:t xml:space="preserve"> en om items by te voeg </w:t>
+      </w:r>
+      <w:r>
+        <w:rPr>
+          <w:rStyle w:val="CSSKlasreelsChar"/>
+        </w:rPr>
+        <w:t>(</w:t>
+      </w:r>
+      <w:r>
+        <w:rPr>
+          <w:rStyle w:val="CSSKlasreelsChar"/>
+        </w:rPr>
+        <w:t>addToCart()</w:t>
+      </w:r>
+      <w:r>
+        <w:rPr>
+          <w:rStyle w:val="CSSKlasreelsChar"/>
+        </w:rPr>
+        <w:t>)</w:t>
+      </w:r>
+      <w:r>
+        <w:t xml:space="preserve"> </w:t>
+      </w:r>
+      <w:r>
+        <w:t>of te verwyder vanuit die mandjie.</w:t>
       </w:r>
     </w:p>
     <w:p>
@@ -2082,13 +2126,34 @@
         <w:ind w:left="567" w:hanging="283"/>
       </w:pPr>
       <w:r>
-        <w:t xml:space="preserve">Top 3 verkope se 3 kaarte wat dinamies op die blad geplaas is. Dit is in die funksie </w:t>
+        <w:t xml:space="preserve">Ek gebruik dit om my inteken modual te skep en bestuur </w:t>
       </w:r>
       <w:r>
         <w:rPr>
           <w:rStyle w:val="CSSKlasreelsChar"/>
         </w:rPr>
-        <w:t>initTopProductsPreview()</w:t>
+        <w:t>(</w:t>
+      </w:r>
+      <w:r>
+        <w:rPr>
+          <w:rStyle w:val="CSSKlasreelsChar"/>
+        </w:rPr>
+        <w:t>createAuthModual()</w:t>
+      </w:r>
+      <w:r>
+        <w:t xml:space="preserve"> , </w:t>
+      </w:r>
+      <w:r>
+        <w:rPr>
+          <w:rStyle w:val="CSSKlasreelsChar"/>
+        </w:rPr>
+        <w:t>showTab()</w:t>
+      </w:r>
+      <w:r>
+        <w:rPr>
+          <w:rStyle w:val="CSSKlasreelsChar"/>
+        </w:rPr>
+        <w:t>)</w:t>
       </w:r>
       <w:r>
         <w:t>.</w:t>
@@ -2104,7 +2169,56 @@
         <w:ind w:left="567" w:hanging="283"/>
       </w:pPr>
       <w:r>
-        <w:t>Ek gebruik ook dit in my voorraadbestuur tabel om dinamies elemente by te voeg, te verwyder of optedateer.</w:t>
+        <w:lastRenderedPageBreak/>
+        <w:t>Dit bou ook elke keer die 3 prente in my produkte galery as jy beweeg.</w:t>
+      </w:r>
+    </w:p>
+    <w:p>
+      <w:pPr>
+        <w:pStyle w:val="ListParagraph"/>
+        <w:numPr>
+          <w:ilvl w:val="1"/>
+          <w:numId w:val="48"/>
+        </w:numPr>
+      </w:pPr>
+      <w:r>
+        <w:t xml:space="preserve">Dit is in die funksies: </w:t>
+      </w:r>
+      <w:r>
+        <w:rPr>
+          <w:rStyle w:val="CSSKlasreelsChar"/>
+        </w:rPr>
+        <w:t>showSlide(i)</w:t>
+      </w:r>
+      <w:r>
+        <w:t xml:space="preserve"> , </w:t>
+      </w:r>
+      <w:r>
+        <w:rPr>
+          <w:rStyle w:val="CSSKlasreelsChar"/>
+        </w:rPr>
+        <w:t>initMiniGalleries()</w:t>
+      </w:r>
+      <w:r>
+        <w:t xml:space="preserve"> , </w:t>
+      </w:r>
+      <w:r>
+        <w:rPr>
+          <w:rStyle w:val="CSSKlasreelsChar"/>
+        </w:rPr>
+        <w:t>showMiniSlide(index)</w:t>
+      </w:r>
+      <w:r>
+        <w:t xml:space="preserve"> en </w:t>
+      </w:r>
+      <w:r>
+        <w:rPr>
+          <w:rStyle w:val="CSSKlasreelsChar"/>
+        </w:rPr>
+        <w:t>renderCarousel()</w:t>
+      </w:r>
+      <w:r>
+        <w:t>.</w:t>
       </w:r>
     </w:p>
     <w:p>
@@ -2117,20 +2231,16 @@
         <w:ind w:left="567" w:hanging="283"/>
       </w:pPr>
       <w:r>
-        <w:lastRenderedPageBreak/>
-        <w:t>Bestelvorm</w:t>
-      </w:r>
-      <w:r>
-        <w:t xml:space="preserve"> se produk rye om produkte by te voeg , verwyder of te soek. Dit is binne </w:t>
+        <w:t xml:space="preserve">Top 3 verkope se 3 kaarte wat dinamies op die blad geplaas is. Dit is in die funksie </w:t>
       </w:r>
       <w:r>
         <w:rPr>
           <w:rStyle w:val="CSSKlasreelsChar"/>
         </w:rPr>
-        <w:t>DOMContentLoaded</w:t>
-      </w:r>
-      <w:r>
-        <w:t xml:space="preserve"> gebruik.</w:t>
+        <w:t>initTopProductsPreview()</w:t>
+      </w:r>
+      <w:r>
+        <w:t>.</w:t>
       </w:r>
     </w:p>
     <w:p>
@@ -2143,25 +2253,7 @@
         <w:ind w:left="567" w:hanging="283"/>
       </w:pPr>
       <w:r>
-        <w:t xml:space="preserve">Ek gebruik di took om die total op te dateer en te wys soos die klient produkte byvoeg of verwyder. Ek doen dit in die funksies </w:t>
-      </w:r>
-      <w:r>
-        <w:rPr>
-          <w:rStyle w:val="CSSKlasreelsChar"/>
-        </w:rPr>
-        <w:t xml:space="preserve">calculateTotal() </w:t>
-      </w:r>
-      <w:r>
-        <w:t xml:space="preserve">en </w:t>
-      </w:r>
-      <w:r>
-        <w:rPr>
-          <w:rStyle w:val="CSSKlasreelsChar"/>
-        </w:rPr>
-        <w:t>updatePaymentVisibility()</w:t>
-      </w:r>
-      <w:r>
-        <w:t>.</w:t>
+        <w:t>Ek gebruik ook dit in my voorraadbestuur tabel om dinamies elemente by te voeg, te verwyder of optedateer.</w:t>
       </w:r>
     </w:p>
     <w:p>
@@ -2174,19 +2266,19 @@
         <w:ind w:left="567" w:hanging="283"/>
       </w:pPr>
       <w:r>
-        <w:t>Ek gebruik dit om velde se sigbaarheid te verander bas</w:t>
-      </w:r>
-      <w:r>
-        <w:t>e</w:t>
-      </w:r>
-      <w:r>
-        <w:t xml:space="preserve">er op wat die gebruiker kies in my vorms soos my afhaal en aflewering </w:t>
-      </w:r>
-      <w:r>
-        <w:t>,</w:t>
-      </w:r>
-      <w:r>
-        <w:t xml:space="preserve"> my besoek datum en tyd en my kaartbesonderhede.</w:t>
+        <w:t>Bestelvorm</w:t>
+      </w:r>
+      <w:r>
+        <w:t xml:space="preserve"> se produk rye om produkte by te voeg , verwyder of te soek. Dit is binne </w:t>
+      </w:r>
+      <w:r>
+        <w:rPr>
+          <w:rStyle w:val="CSSKlasreelsChar"/>
+        </w:rPr>
+        <w:t>DOMContentLoaded</w:t>
+      </w:r>
+      <w:r>
+        <w:t xml:space="preserve"> gebruik.</w:t>
       </w:r>
     </w:p>
     <w:p>
@@ -2199,13 +2291,25 @@
         <w:ind w:left="567" w:hanging="283"/>
       </w:pPr>
       <w:r>
-        <w:t xml:space="preserve">Ek gebruik dit in my kontakvorm om die boodskap veld verpligtend te maak as </w:t>
-      </w:r>
-      <w:r>
-        <w:t>navrae</w:t>
-      </w:r>
-      <w:r>
-        <w:t xml:space="preserve"> gekies is.</w:t>
+        <w:t xml:space="preserve">Ek gebruik di took om die total op te dateer en te wys soos die klient produkte byvoeg of verwyder. Ek doen dit in die funksies </w:t>
+      </w:r>
+      <w:r>
+        <w:rPr>
+          <w:rStyle w:val="CSSKlasreelsChar"/>
+        </w:rPr>
+        <w:t xml:space="preserve">calculateTotal() </w:t>
+      </w:r>
+      <w:r>
+        <w:t xml:space="preserve">en </w:t>
+      </w:r>
+      <w:r>
+        <w:rPr>
+          <w:rStyle w:val="CSSKlasreelsChar"/>
+        </w:rPr>
+        <w:t>updatePaymentVisibility()</w:t>
+      </w:r>
+      <w:r>
+        <w:t>.</w:t>
       </w:r>
     </w:p>
     <w:p>
@@ -2218,10 +2322,19 @@
         <w:ind w:left="567" w:hanging="283"/>
       </w:pPr>
       <w:r>
-        <w:t>Ek gebruik dit vir my hamburger menu op mobiel</w:t>
-      </w:r>
-      <w:r>
-        <w:t xml:space="preserve"> waneer dit oopgemaak word , skakels en gekose subskakels wys en die ikoon verander van 3 strepies na ‘n kruisie.</w:t>
+        <w:t>Ek gebruik dit om velde se sigbaarheid te verander bas</w:t>
+      </w:r>
+      <w:r>
+        <w:t>e</w:t>
+      </w:r>
+      <w:r>
+        <w:t xml:space="preserve">er op wat die gebruiker kies in my vorms soos my afhaal en aflewering </w:t>
+      </w:r>
+      <w:r>
+        <w:t>,</w:t>
+      </w:r>
+      <w:r>
+        <w:t xml:space="preserve"> my besoek datum en tyd en my kaartbesonderhede.</w:t>
       </w:r>
     </w:p>
     <w:p>
@@ -2234,7 +2347,13 @@
         <w:ind w:left="567" w:hanging="283"/>
       </w:pPr>
       <w:r>
-        <w:t>Ek gebruik dit vir my skakel knoppie op my video se in vervaag animasie en vir my split afdelings se in vervaag animasie.</w:t>
+        <w:t xml:space="preserve">Ek gebruik dit in my kontakvorm om die boodskap veld verpligtend te maak as </w:t>
+      </w:r>
+      <w:r>
+        <w:t>navrae</w:t>
+      </w:r>
+      <w:r>
+        <w:t xml:space="preserve"> gekies is.</w:t>
       </w:r>
     </w:p>
     <w:p>
@@ -2247,13 +2366,41 @@
         <w:ind w:left="567" w:hanging="283"/>
       </w:pPr>
       <w:r>
+        <w:t>Ek gebruik dit vir my hamburger menu op mobiel</w:t>
+      </w:r>
+      <w:r>
+        <w:t xml:space="preserve"> waneer dit oopgemaak word , skakels en gekose subskakels wys en die ikoon verander van 3 strepies na ‘n kruisie.</w:t>
+      </w:r>
+    </w:p>
+    <w:p>
+      <w:pPr>
+        <w:pStyle w:val="ListParagraph"/>
+        <w:numPr>
+          <w:ilvl w:val="0"/>
+          <w:numId w:val="48"/>
+        </w:numPr>
+        <w:ind w:left="567" w:hanging="283"/>
+      </w:pPr>
+      <w:r>
+        <w:t>Ek gebruik dit vir my skakel knoppie op my video se in vervaag animasie en vir my split afdelings se in vervaag animasie.</w:t>
+      </w:r>
+    </w:p>
+    <w:p>
+      <w:pPr>
+        <w:pStyle w:val="ListParagraph"/>
+        <w:numPr>
+          <w:ilvl w:val="0"/>
+          <w:numId w:val="48"/>
+        </w:numPr>
+        <w:ind w:left="567" w:hanging="283"/>
+      </w:pPr>
+      <w:r>
         <w:t>Ek gebruik dit ook vir my terug na bo koppie sodat dit eers wys waneer jy verby ‘n sekere punt op die webblad is</w:t>
       </w:r>
     </w:p>
     <w:p>
       <w:pPr>
-        <w:pStyle w:val="Heading3"/>
-        <w:spacing w:after="240"/>
+        <w:pStyle w:val="Heading2"/>
       </w:pPr>
       <w:bookmarkStart w:id="15" w:name="_Toc226443023"/>
       <w:bookmarkStart w:id="16" w:name="_Toc226457390"/>
@@ -2275,13 +2422,7 @@
         <w:t>Ek gebruik verskeie</w:t>
       </w:r>
       <w:r>
-        <w:t xml:space="preserve"> </w:t>
-      </w:r>
-      <w:r>
-        <w:t>(37 prente</w:t>
-      </w:r>
-      <w:r>
-        <w:t>)</w:t>
+        <w:t xml:space="preserve"> (37 prente)</w:t>
       </w:r>
       <w:r>
         <w:t xml:space="preserve"> </w:t>
@@ -2324,16 +2465,7 @@
         <w:t>Ek gebruik prente (</w:t>
       </w:r>
       <w:r>
-        <w:t>Plaashek</w:t>
-      </w:r>
-      <w:r>
-        <w:t xml:space="preserve">, </w:t>
-      </w:r>
-      <w:r>
-        <w:t>Plaas</w:t>
-      </w:r>
-      <w:r>
-        <w:t>, 1Trop, Produkte</w:t>
+        <w:t>Plaashek, Plaas, 1Trop, Produkte</w:t>
       </w:r>
       <w:r>
         <w:t>, Voorraad , PlaasBoShot, SkaapFamilie</w:t>
@@ -2358,13 +2490,7 @@
         <w:ind w:left="1560" w:hanging="284"/>
       </w:pPr>
       <w:r>
-        <w:t>Ek gebruik ‘n prent (</w:t>
-      </w:r>
-      <w:r>
-        <w:t>Logo</w:t>
-      </w:r>
-      <w:r>
-        <w:t>) in my kopbalk op elke bladsy as my handelsmerk</w:t>
+        <w:t>Ek gebruik ‘n prent (Logo) in my kopbalk op elke bladsy as my handelsmerk</w:t>
       </w:r>
     </w:p>
     <w:p>
@@ -2408,25 +2534,7 @@
         <w:ind w:left="1560" w:hanging="284"/>
       </w:pPr>
       <w:r>
-        <w:t>Ek gebruik prente (</w:t>
-      </w:r>
-      <w:r>
-        <w:t>Marino</w:t>
-      </w:r>
-      <w:r>
-        <w:t xml:space="preserve">, </w:t>
-      </w:r>
-      <w:r>
-        <w:t>Skeer</w:t>
-      </w:r>
-      <w:r>
-        <w:t xml:space="preserve">, </w:t>
-      </w:r>
-      <w:r>
-        <w:t>Grazing</w:t>
-      </w:r>
-      <w:r>
-        <w:t>) vir by hoogtepunte</w:t>
+        <w:t>Ek gebruik prente (Marino, Skeer, Grazing) vir by hoogtepunte</w:t>
       </w:r>
     </w:p>
     <w:p>
@@ -2439,10 +2547,7 @@
         <w:ind w:left="1560" w:hanging="284"/>
       </w:pPr>
       <w:r>
-        <w:t xml:space="preserve">Ek gebruik ‘n prent (Logo) </w:t>
-      </w:r>
-      <w:r>
-        <w:t>by elke logo blok</w:t>
+        <w:t>Ek gebruik ‘n prent (Logo) by elke logo blok</w:t>
       </w:r>
     </w:p>
     <w:p>
@@ -2455,13 +2560,7 @@
         <w:ind w:left="1560" w:hanging="284"/>
       </w:pPr>
       <w:r>
-        <w:t>Ek gebruik ‘n prent (</w:t>
-      </w:r>
-      <w:r>
-        <w:t>1Merino</w:t>
-      </w:r>
-      <w:r>
-        <w:t>)</w:t>
+        <w:t>Ek gebruik ‘n prent (1Merino)</w:t>
       </w:r>
       <w:r>
         <w:t xml:space="preserve"> by my bestuursbenadering</w:t>
@@ -2477,13 +2576,7 @@
         <w:ind w:left="1560" w:hanging="284"/>
       </w:pPr>
       <w:r>
-        <w:t>Ek gebruik ‘n prent (</w:t>
-      </w:r>
-      <w:r>
-        <w:t>RotationalGrazing.jpg</w:t>
-      </w:r>
-      <w:r>
-        <w:t>) as die agtergrond prent by my volhoubare toekoms asook vir my laaste afdeling voor my voetskrif</w:t>
+        <w:t>Ek gebruik ‘n prent (RotationalGrazing.jpg) as die agtergrond prent by my volhoubare toekoms asook vir my laaste afdeling voor my voetskrif</w:t>
       </w:r>
     </w:p>
     <w:p>
@@ -2496,19 +2589,7 @@
         <w:ind w:left="1560" w:hanging="284"/>
       </w:pPr>
       <w:r>
-        <w:t>Ek gebruik prente (</w:t>
-      </w:r>
-      <w:r>
-        <w:t>1Shed</w:t>
-      </w:r>
-      <w:r>
-        <w:t xml:space="preserve">, </w:t>
-      </w:r>
-      <w:r>
-        <w:t>Shed</w:t>
-      </w:r>
-      <w:r>
-        <w:t>, Grazing, 1Trop , Babies , Skeer , Voer) in my gallery</w:t>
+        <w:t>Ek gebruik prente (1Shed, Shed, Grazing, 1Trop , Babies , Skeer , Voer) in my gallery</w:t>
       </w:r>
     </w:p>
     <w:p>
@@ -2546,25 +2627,7 @@
         <w:ind w:left="1560" w:hanging="284"/>
       </w:pPr>
       <w:r>
-        <w:t>Ek gebruik prente (Marino , 1Merino , Dorper , 1Dorper , 2Dorper , 3Dorper , 4Dorper , BlackheadPersian , 1</w:t>
-      </w:r>
-      <w:r>
-        <w:t>BlackheadPersian</w:t>
-      </w:r>
-      <w:r>
-        <w:t xml:space="preserve"> , 2</w:t>
-      </w:r>
-      <w:r>
-        <w:t>BlackheadPersian</w:t>
-      </w:r>
-      <w:r>
-        <w:t xml:space="preserve"> , 3</w:t>
-      </w:r>
-      <w:r>
-        <w:t>BlackheadPersian</w:t>
-      </w:r>
-      <w:r>
-        <w:t>) vir elke skaap ras se galery</w:t>
+        <w:t>Ek gebruik prente (Marino , 1Merino , Dorper , 1Dorper , 2Dorper , 3Dorper , 4Dorper , BlackheadPersian , 1BlackheadPersian , 2BlackheadPersian , 3BlackheadPersian) vir elke skaap ras se galery</w:t>
       </w:r>
     </w:p>
     <w:p>
@@ -2632,6 +2695,7 @@
         </w:rPr>
       </w:pPr>
       <w:r>
+        <w:lastRenderedPageBreak/>
         <w:t xml:space="preserve">Die video het geronde hoeke </w:t>
       </w:r>
       <w:r>
@@ -2676,23 +2740,7 @@
           <w:rStyle w:val="CSSKlasreelsChar"/>
           <w:lang w:val="en-ZA"/>
         </w:rPr>
-        <w:t xml:space="preserve">box-shadow: 0 4px 15px </w:t>
-      </w:r>
-      <w:proofErr w:type="spellStart"/>
-      <w:r>
-        <w:rPr>
-          <w:rStyle w:val="CSSKlasreelsChar"/>
-          <w:lang w:val="en-ZA"/>
-        </w:rPr>
-        <w:t>rgba</w:t>
-      </w:r>
-      <w:proofErr w:type="spellEnd"/>
-      <w:r>
-        <w:rPr>
-          <w:rStyle w:val="CSSKlasreelsChar"/>
-          <w:lang w:val="en-ZA"/>
-        </w:rPr>
-        <w:t>(0,0,0,0.2);</w:t>
+        <w:t>box-shadow: 0 4px 15px rgba(0,0,0,0.2);</w:t>
       </w:r>
       <w:r>
         <w:rPr>
@@ -2846,14 +2894,7 @@
           <w:b/>
           <w:bCs/>
         </w:rPr>
-        <w:t xml:space="preserve">Bemarking.mp4 </w:t>
-      </w:r>
-      <w:r>
-        <w:rPr>
-          <w:b/>
-          <w:bCs/>
-        </w:rPr>
-        <w:t>se JS:</w:t>
+        <w:t>Bemarking.mp4 se JS:</w:t>
       </w:r>
     </w:p>
     <w:p>
@@ -2865,7 +2906,6 @@
         </w:numPr>
       </w:pPr>
       <w:r>
-        <w:lastRenderedPageBreak/>
         <w:t>Voorwaardes</w:t>
       </w:r>
     </w:p>
@@ -2894,39 +2934,7 @@
           <w:rStyle w:val="CSSKlasreelsChar"/>
           <w:lang w:val="en-ZA"/>
         </w:rPr>
-        <w:t>if (</w:t>
-      </w:r>
-      <w:proofErr w:type="spellStart"/>
-      <w:r>
-        <w:rPr>
-          <w:rStyle w:val="CSSKlasreelsChar"/>
-          <w:lang w:val="en-ZA"/>
-        </w:rPr>
-        <w:t>video.currentTime</w:t>
-      </w:r>
-      <w:proofErr w:type="spellEnd"/>
-      <w:r>
-        <w:rPr>
-          <w:rStyle w:val="CSSKlasreelsChar"/>
-          <w:lang w:val="en-ZA"/>
-        </w:rPr>
-        <w:t xml:space="preserve"> &gt;= </w:t>
-      </w:r>
-      <w:proofErr w:type="spellStart"/>
-      <w:r>
-        <w:rPr>
-          <w:rStyle w:val="CSSKlasreelsChar"/>
-          <w:lang w:val="en-ZA"/>
-        </w:rPr>
-        <w:t>video.duration</w:t>
-      </w:r>
-      <w:proofErr w:type="spellEnd"/>
-      <w:r>
-        <w:rPr>
-          <w:rStyle w:val="CSSKlasreelsChar"/>
-          <w:lang w:val="en-ZA"/>
-        </w:rPr>
-        <w:t xml:space="preserve"> - 5</w:t>
+        <w:t>if (video.currentTime &gt;= video.duration - 5</w:t>
       </w:r>
       <w:r>
         <w:rPr>
@@ -2991,21 +2999,12 @@
         </w:rPr>
         <w:t>(</w:t>
       </w:r>
-      <w:proofErr w:type="spellStart"/>
       <w:r>
         <w:rPr>
           <w:rStyle w:val="CSSKlasreelsChar"/>
           <w:lang w:val="en-ZA"/>
         </w:rPr>
-        <w:t>endLogo.style.display</w:t>
-      </w:r>
-      <w:proofErr w:type="spellEnd"/>
-      <w:r>
-        <w:rPr>
-          <w:rStyle w:val="CSSKlasreelsChar"/>
-          <w:lang w:val="en-ZA"/>
-        </w:rPr>
-        <w:t xml:space="preserve"> = 'block'</w:t>
+        <w:t>endLogo.style.display = 'block'</w:t>
       </w:r>
       <w:r>
         <w:rPr>
@@ -3017,13 +3016,7 @@
         <w:rPr>
           <w:rStyle w:val="CSSKlasreelsChar"/>
         </w:rPr>
-        <w:t>endLogo.style.opacity = '1'</w:t>
-      </w:r>
-      <w:r>
-        <w:rPr>
-          <w:rStyle w:val="CSSKlasreelsChar"/>
-        </w:rPr>
-        <w:t>)</w:t>
+        <w:t>endLogo.style.opacity = '1')</w:t>
       </w:r>
     </w:p>
     <w:p>

</xml_diff>